<commit_message>
Relax document generation and update templates
</commit_message>
<xml_diff>
--- a/11 - Notificacion familias.docx
+++ b/11 - Notificacion familias.docx
@@ -847,69 +847,6 @@
     </w:p>
     <w:p>
       <w:pPr>
-        <w:pStyle w:val="Encabezado"/>
-        <w:tabs>
-          <w:tab w:val="clear" w:pos="4252"/>
-          <w:tab w:val="clear" w:pos="8504"/>
-        </w:tabs>
-        <w:ind w:left="5814" w:right="261" w:firstLine="567"/>
-        <w:rPr>
-          <w:rFonts w:cs="Arial"/>
-          <w:szCs w:val="20"/>
-        </w:rPr>
-      </w:pPr>
-    </w:p>
-    <w:p>
-      <w:pPr>
-        <w:ind w:left="284" w:firstLine="1276"/>
-        <w:jc w:val="both"/>
-        <w:rPr>
-          <w:rFonts w:cs="Arial"/>
-          <w:sz w:val="24"/>
-        </w:rPr>
-      </w:pPr>
-    </w:p>
-    <w:p>
-      <w:pPr>
-        <w:ind w:left="284" w:firstLine="1276"/>
-        <w:jc w:val="both"/>
-        <w:rPr>
-          <w:rFonts w:cs="Arial"/>
-          <w:sz w:val="24"/>
-        </w:rPr>
-      </w:pPr>
-    </w:p>
-    <w:p>
-      <w:pPr>
-        <w:rPr>
-          <w:rFonts w:ascii="Arial Narrow" w:hAnsi="Arial Narrow"/>
-          <w:szCs w:val="22"/>
-        </w:rPr>
-      </w:pPr>
-    </w:p>
-    <w:p>
-      <w:pPr>
-        <w:rPr>
-          <w:rFonts w:ascii="Arial Narrow" w:hAnsi="Arial Narrow"/>
-          <w:b/>
-          <w:szCs w:val="22"/>
-        </w:rPr>
-      </w:pPr>
-    </w:p>
-    <w:p>
-      <w:pPr>
-        <w:jc w:val="center"/>
-        <w:rPr>
-          <w:rFonts w:asciiTheme="minorHAnsi" w:hAnsiTheme="minorHAnsi" w:cs="Microsoft Uighur"/>
-          <w:szCs w:val="22"/>
-          <w:lang w:val="es-ES_tradnl"/>
-        </w:rPr>
-      </w:pPr>
-      <w:bookmarkStart w:id="0" w:name="JR_PAGE_ANCHOR_0_1"/>
-      <w:bookmarkEnd w:id="0"/>
-    </w:p>
-    <w:p>
-      <w:pPr>
         <w:autoSpaceDN w:val="0"/>
         <w:adjustRightInd w:val="0"/>
         <w:spacing w:line="279" w:lineRule="atLeast"/>
@@ -919,6 +856,8 @@
           <w:szCs w:val="22"/>
         </w:rPr>
       </w:pPr>
+      <w:bookmarkStart w:id="0" w:name="JR_PAGE_ANCHOR_0_1"/>
+      <w:bookmarkEnd w:id="0"/>
       <w:r>
         <w:rPr>
           <w:rFonts w:asciiTheme="minorHAnsi" w:hAnsiTheme="minorHAnsi" w:cstheme="minorHAnsi"/>
@@ -6297,19 +6236,6 @@
 </file>
 
 <file path=customXml/item1.xml><?xml version="1.0" encoding="utf-8"?>
-<?mso-contentType ?>
-<FormTemplates xmlns="http://schemas.microsoft.com/sharepoint/v3/contenttype/forms">
-  <Display>DocumentLibraryForm</Display>
-  <Edit>DocumentLibraryForm</Edit>
-  <New>DocumentLibraryForm</New>
-</FormTemplates>
-</file>
-
-<file path=customXml/item2.xml><?xml version="1.0" encoding="utf-8"?>
-<b:Sources xmlns:b="http://schemas.openxmlformats.org/officeDocument/2006/bibliography" xmlns="http://schemas.openxmlformats.org/officeDocument/2006/bibliography" SelectedStyle="\APA.XSL" StyleName="APA"/>
-</file>
-
-<file path=customXml/item3.xml><?xml version="1.0" encoding="utf-8"?>
 <ct:contentTypeSchema xmlns:ct="http://schemas.microsoft.com/office/2006/metadata/contentType" xmlns:ma="http://schemas.microsoft.com/office/2006/metadata/properties/metaAttributes" ct:_="" ma:_="" ma:contentTypeName="Documento" ma:contentTypeID="0x010100BE5E44177913B140848DC48051328551" ma:contentTypeVersion="10" ma:contentTypeDescription="Crear nuevo documento." ma:contentTypeScope="" ma:versionID="e56293935e30344837f372b4cf6c3dd2">
   <xsd:schema xmlns:xsd="http://www.w3.org/2001/XMLSchema" xmlns:xs="http://www.w3.org/2001/XMLSchema" xmlns:p="http://schemas.microsoft.com/office/2006/metadata/properties" xmlns:ns2="c8a3e049-7505-4416-9a92-b091f6792637" targetNamespace="http://schemas.microsoft.com/office/2006/metadata/properties" ma:root="true" ma:fieldsID="dd180e20af6143d6ed5990269d1f6a3c" ns2:_="">
     <xsd:import namespace="c8a3e049-7505-4416-9a92-b091f6792637"/>
@@ -6487,6 +6413,19 @@
 </ct:contentTypeSchema>
 </file>
 
+<file path=customXml/item2.xml><?xml version="1.0" encoding="utf-8"?>
+<b:Sources xmlns:b="http://schemas.openxmlformats.org/officeDocument/2006/bibliography" xmlns="http://schemas.openxmlformats.org/officeDocument/2006/bibliography" SelectedStyle="\APA.XSL" StyleName="APA"/>
+</file>
+
+<file path=customXml/item3.xml><?xml version="1.0" encoding="utf-8"?>
+<?mso-contentType ?>
+<FormTemplates xmlns="http://schemas.microsoft.com/sharepoint/v3/contenttype/forms">
+  <Display>DocumentLibraryForm</Display>
+  <Edit>DocumentLibraryForm</Edit>
+  <New>DocumentLibraryForm</New>
+</FormTemplates>
+</file>
+
 <file path=customXml/item4.xml><?xml version="1.0" encoding="utf-8"?>
 <p:properties xmlns:p="http://schemas.microsoft.com/office/2006/metadata/properties" xmlns:xsi="http://www.w3.org/2001/XMLSchema-instance" xmlns:pc="http://schemas.microsoft.com/office/infopath/2007/PartnerControls">
   <documentManagement>
@@ -6498,22 +6437,6 @@
 </file>
 
 <file path=customXml/itemProps1.xml><?xml version="1.0" encoding="utf-8"?>
-<ds:datastoreItem xmlns:ds="http://schemas.openxmlformats.org/officeDocument/2006/customXml" ds:itemID="{B93F7471-765B-4AA2-B4DA-976D4181C4E6}">
-  <ds:schemaRefs>
-    <ds:schemaRef ds:uri="http://schemas.microsoft.com/sharepoint/v3/contenttype/forms"/>
-  </ds:schemaRefs>
-</ds:datastoreItem>
-</file>
-
-<file path=customXml/itemProps2.xml><?xml version="1.0" encoding="utf-8"?>
-<ds:datastoreItem xmlns:ds="http://schemas.openxmlformats.org/officeDocument/2006/customXml" ds:itemID="{456916B8-F8B8-4370-A115-CD493BAE6E74}">
-  <ds:schemaRefs>
-    <ds:schemaRef ds:uri="http://schemas.openxmlformats.org/officeDocument/2006/bibliography"/>
-  </ds:schemaRefs>
-</ds:datastoreItem>
-</file>
-
-<file path=customXml/itemProps3.xml><?xml version="1.0" encoding="utf-8"?>
 <ds:datastoreItem xmlns:ds="http://schemas.openxmlformats.org/officeDocument/2006/customXml" ds:itemID="{D084AE81-4F68-4DDE-91AD-E8921E704863}">
   <ds:schemaRefs>
     <ds:schemaRef ds:uri="http://schemas.microsoft.com/office/2006/metadata/contentType"/>
@@ -6531,6 +6454,22 @@
 </ds:datastoreItem>
 </file>
 
+<file path=customXml/itemProps2.xml><?xml version="1.0" encoding="utf-8"?>
+<ds:datastoreItem xmlns:ds="http://schemas.openxmlformats.org/officeDocument/2006/customXml" ds:itemID="{456916B8-F8B8-4370-A115-CD493BAE6E74}">
+  <ds:schemaRefs>
+    <ds:schemaRef ds:uri="http://schemas.openxmlformats.org/officeDocument/2006/bibliography"/>
+  </ds:schemaRefs>
+</ds:datastoreItem>
+</file>
+
+<file path=customXml/itemProps3.xml><?xml version="1.0" encoding="utf-8"?>
+<ds:datastoreItem xmlns:ds="http://schemas.openxmlformats.org/officeDocument/2006/customXml" ds:itemID="{B93F7471-765B-4AA2-B4DA-976D4181C4E6}">
+  <ds:schemaRefs>
+    <ds:schemaRef ds:uri="http://schemas.microsoft.com/sharepoint/v3/contenttype/forms"/>
+  </ds:schemaRefs>
+</ds:datastoreItem>
+</file>
+
 <file path=customXml/itemProps4.xml><?xml version="1.0" encoding="utf-8"?>
 <ds:datastoreItem xmlns:ds="http://schemas.openxmlformats.org/officeDocument/2006/customXml" ds:itemID="{BFD936B3-9663-47C3-8640-143E61BEB4C7}">
   <ds:schemaRefs>

</xml_diff>